<commit_message>
Add the v4 and v5 trees, replay example, and scrubber fixes.
Overlay agent-watch and the pipeline with mimic detection, harness labels, static replay, and the benchmark kit. Place the rebuilt whitepaper, change notes, and sample replay under docs, and add the prior-art comparison to the root README. Close a scrubber gap where a unicode escape of a percent-encoded secret skipped the second decode, and scrub pipeline dict keys the same way agent-watch does.

Co-authored-by: freeling10-prog <freeling10-prog@users.noreply.github.com>
</commit_message>
<xml_diff>
--- a/docs/rogue-ai-detection-whitepaper.docx
+++ b/docs/rogue-ai-detection-whitepaper.docx
@@ -844,7 +844,22 @@
           <w:b w:val="0"/>
           <w:i w:val="0"/>
         </w:rPr>
-        <w:t>Test status: 42 automated tests pass (Python 3.13.5, scikit-learn 1.9.1, numpy 2.5.4, networkx 3.7), covering schema and collectors, features, detectors, the pipeline on several seeds, alert-log tamper detection, the STIX export, report validation and the web endpoints. The documented install and run steps were also checked in a clean virtual environment.</w:t>
+        <w:t>Test status of the first version: 42 automated tests passed (Python 3.13.5, scikit-learn 1.9.1, numpy 2.5.4, networkx 3.7), covering schema and collectors, features, detectors, the pipeline on several seeds, alert-log tamper detection, the STIX export, report validation and the web endpoints. The documented install and run steps were also checked in a clean virtual environment.</w:t>
+      </w:r>
+    </w:p>
+    <w:p>
+      <w:r>
+        <w:rPr>
+          <w:b/>
+          <w:i w:val="0"/>
+        </w:rPr>
+        <w:t xml:space="preserve">Later versions (v3 to v5). </w:t>
+      </w:r>
+      <w:r>
+        <w:rPr>
+          <w:b w:val="0"/>
+        </w:rPr>
+        <w:t>The companion code has since grown into two projects. agent-watch is a localhost-only honeypot and log detector; rogue-ai-pipeline is the multi-layer scorer. v3 added a mirrored access stream, passive web detectors (asset starvation, unlinked jumps), score floors and a decoy MCP endpoint. v4 separated selective asset blocking from true starvation, added an ARIA canary and a three-boolean interaction beacon for browser-backed mimics, a two-signal corroboration gate, per-layer attribution of benign leads, an empirical link-graph fallback and an encoded-secret scrubber port. v5 adds a deterministic harness fingerprint (six archetypes, each with reasons and a low, medium or high confidence that describes how much of the signature was seen) and a static, escaped HTML replay page for human reviewers. Current test status: agent-watch 446 passed and 1 skipped, rogue-ai-pipeline 331 passed, pipeline type checks clean. These are regression checks on synthetic data.</w:t>
       </w:r>
     </w:p>
     <w:p>
@@ -1640,13 +1655,13 @@
         <w:pStyle w:val="Heading1"/>
       </w:pPr>
       <w:r>
-        <w:t>9. Related work and novelty</w:t>
+        <w:t>9. Related work and comparative architecture</w:t>
       </w:r>
     </w:p>
     <w:p>
       <w:pPr/>
       <w:r>
-        <w:t>This section compares the companion code, a honeypot and log detector (decoy API documents, a decoy MCP endpoint, canary pages, a coordination board with a handoff token and nonce, a secret scrubber, passive detectors for asset starvation and unlinked jumps, score floors) plus the multi-layer pipeline, with work that already exists. A web search on 23 October 2026 found that most of the honeypot side has been built before, mostly in the last year. Each source below was opened and read; the full table, dates and the items that could not be verified are in the project file prior-art.md [45].</w:t>
+        <w:t>This section compares the companion code with work that already exists: a honeypot and log detector (decoy API documents, a decoy MCP endpoint, canary pages, a coordination board with a handoff token and nonce, a secret scrubber, passive detectors for asset starvation and unlinked jumps, an ARIA canary and a three-boolean interaction beacon, score floors, a harness fingerprint, a static replay page) plus the multi-layer pipeline. The comparison rests on a limited public web search on 23 October 2026, not a systematic review. Each source in the table was opened and read; the full table, dates and the items that could not be verified are in the project file docs/prior-art.md [45]. Wherever the table says “not found in my search”, that means exactly that: I did not find it documented in the pages I read, which is not evidence that the capability is absent. Drosera [27] overlaps the web side most closely.</w:t>
       </w:r>
     </w:p>
     <w:tbl>
@@ -1658,9 +1673,9 @@
         <w:tblLayout w:type="fixed"/>
       </w:tblPr>
       <w:tblGrid>
-        <w:gridCol w:w="1500"/>
-        <w:gridCol w:w="3300"/>
-        <w:gridCol w:w="4500"/>
+        <w:gridCol w:w="1800"/>
+        <w:gridCol w:w="3700"/>
+        <w:gridCol w:w="3800"/>
       </w:tblGrid>
       <w:tr>
         <w:trPr>
@@ -1669,7 +1684,7 @@
         </w:trPr>
         <w:tc>
           <w:tcPr>
-            <w:tcW w:type="dxa" w:w="1500"/>
+            <w:tcW w:type="dxa" w:w="1800"/>
             <w:shd w:val="clear" w:color="auto" w:fill="E8E8EC"/>
           </w:tcPr>
           <w:p>
@@ -1678,13 +1693,13 @@
                 <w:b/>
                 <w:sz w:val="19"/>
               </w:rPr>
-              <w:t>Area</w:t>
+              <w:t>Capability</w:t>
             </w:r>
           </w:p>
         </w:tc>
         <w:tc>
           <w:tcPr>
-            <w:tcW w:type="dxa" w:w="3300"/>
+            <w:tcW w:type="dxa" w:w="3700"/>
             <w:shd w:val="clear" w:color="auto" w:fill="E8E8EC"/>
           </w:tcPr>
           <w:p>
@@ -1693,13 +1708,13 @@
                 <w:b/>
                 <w:sz w:val="19"/>
               </w:rPr>
-              <w:t>Closest prior art</w:t>
+              <w:t>Documented in prior art (what I read)</w:t>
             </w:r>
           </w:p>
         </w:tc>
         <w:tc>
           <w:tcPr>
-            <w:tcW w:type="dxa" w:w="4500"/>
+            <w:tcW w:type="dxa" w:w="3800"/>
             <w:shd w:val="clear" w:color="auto" w:fill="E8E8EC"/>
           </w:tcPr>
           <w:p>
@@ -1708,7 +1723,7 @@
                 <w:b/>
                 <w:sz w:val="19"/>
               </w:rPr>
-              <w:t>What it shares with our design</w:t>
+              <w:t>This stack (all numbers synthetic, same author)</w:t>
             </w:r>
           </w:p>
         </w:tc>
@@ -1719,40 +1734,40 @@
         </w:trPr>
         <w:tc>
           <w:tcPr>
-            <w:tcW w:type="dxa" w:w="1500"/>
+            <w:tcW w:type="dxa" w:w="1800"/>
           </w:tcPr>
           <w:p>
             <w:r>
               <w:rPr>
                 <w:sz w:val="19"/>
               </w:rPr>
-              <w:t>Honeypots for LLM agents</w:t>
+              <w:t>Hidden-instruction canary pages</w:t>
             </w:r>
           </w:p>
         </w:tc>
         <w:tc>
           <w:tcPr>
-            <w:tcW w:type="dxa" w:w="3300"/>
+            <w:tcW w:type="dxa" w:w="3700"/>
           </w:tcPr>
           <w:p>
             <w:r>
               <w:rPr>
                 <w:sz w:val="19"/>
               </w:rPr>
-              <w:t>Palisade LLM Agent Honeypot [26]; Drosera [27]; Sundew [28]; Thinkst Agent Provocateur [29]</w:t>
+              <w:t>Palisade [26]; Drosera [27]; Thinkst [29]. Documented.</w:t>
             </w:r>
           </w:p>
         </w:tc>
         <w:tc>
           <w:tcPr>
-            <w:tcW w:type="dxa" w:w="4500"/>
+            <w:tcW w:type="dxa" w:w="3800"/>
           </w:tcPr>
           <w:p>
             <w:r>
               <w:rPr>
                 <w:sz w:val="19"/>
               </w:rPr>
-              <w:t>Hidden instructions that only an instruction-following agent acts on; per-session signed tokens; decoy OpenAPI, llms.txt and MCP surfaces; agent self-disclosure prompts; a timing signal; an asset-starvation score (Drosera).</w:t>
+              <w:t>Yes. Contact with a canary is a lead, not proof of intent.</w:t>
             </w:r>
           </w:p>
         </w:tc>
@@ -1763,40 +1778,40 @@
         </w:trPr>
         <w:tc>
           <w:tcPr>
-            <w:tcW w:type="dxa" w:w="1500"/>
+            <w:tcW w:type="dxa" w:w="1800"/>
           </w:tcPr>
           <w:p>
             <w:r>
               <w:rPr>
                 <w:sz w:val="19"/>
               </w:rPr>
-              <w:t>Decoy MCP servers and canaries</w:t>
+              <w:t>Per-session token / nonce round trip</w:t>
             </w:r>
           </w:p>
         </w:tc>
         <w:tc>
           <w:tcPr>
-            <w:tcW w:type="dxa" w:w="3300"/>
+            <w:tcW w:type="dxa" w:w="3700"/>
           </w:tcPr>
           <w:p>
             <w:r>
               <w:rPr>
                 <w:sz w:val="19"/>
               </w:rPr>
-              <w:t>Thinkst MCP Canarytoken [30]; MCP Decoy [31]; HoneyMCP [32]; Beelzebub [33]</w:t>
+              <w:t>Drosera: HMAC-signed ticket [27]. Others: not found in my search.</w:t>
             </w:r>
           </w:p>
         </w:tc>
         <w:tc>
           <w:tcPr>
-            <w:tcW w:type="dxa" w:w="4500"/>
+            <w:tcW w:type="dxa" w:w="3800"/>
           </w:tcPr>
           <w:p>
             <w:r>
               <w:rPr>
                 <w:sz w:val="19"/>
               </w:rPr>
-              <w:t>Fake tools that nobody legitimate calls; tools/list as one signal and a tool call as the stronger one; logging of arguments.</w:t>
+              <w:t>Handoff token plus nonce on the coordination board; a token replayed from another session or address is a separate signal (prior art: not found in my search).</w:t>
             </w:r>
           </w:p>
         </w:tc>
@@ -1807,40 +1822,40 @@
         </w:trPr>
         <w:tc>
           <w:tcPr>
-            <w:tcW w:type="dxa" w:w="1500"/>
+            <w:tcW w:type="dxa" w:w="1800"/>
           </w:tcPr>
           <w:p>
             <w:r>
               <w:rPr>
                 <w:sz w:val="19"/>
               </w:rPr>
-              <w:t>Bot and agent detection</w:t>
+              <w:t>Decoy MCP endpoint, tools/list then call</w:t>
             </w:r>
           </w:p>
         </w:tc>
         <w:tc>
           <w:tcPr>
-            <w:tcW w:type="dxa" w:w="3300"/>
+            <w:tcW w:type="dxa" w:w="3700"/>
           </w:tcPr>
           <w:p>
             <w:r>
               <w:rPr>
                 <w:sz w:val="19"/>
               </w:rPr>
-              <w:t>Cloudflare Web Bot Auth [34], AI Labyrinth [35]; DataDome [36]; JA3/JA4 [37]; FP-Agent [38]; Fayolle et al. [39]; Lugoloobi et al. [40]; Li et al. [41]; Doran and Gokhale [44]</w:t>
+              <w:t>Sundew [28]; MCP Decoy [31]; HoneyMCP [32]; Thinkst [30]. Documented.</w:t>
             </w:r>
           </w:p>
         </w:tc>
         <w:tc>
           <w:tcPr>
-            <w:tcW w:type="dxa" w:w="4500"/>
+            <w:tcW w:type="dxa" w:w="3800"/>
           </w:tcPr>
           <w:p>
             <w:r>
               <w:rPr>
                 <w:sz w:val="19"/>
               </w:rPr>
-              <w:t>Honeysites as ground truth; hidden-link traps; behavior and timing features; identity versus intent split. Fingerprinting (JA4, browser) and signed agents are prior art we do not implement.</w:t>
+              <w:t>Yes; the harness fingerprint adds an mcp_tool_runner label.</w:t>
             </w:r>
           </w:p>
         </w:tc>
@@ -1851,40 +1866,304 @@
         </w:trPr>
         <w:tc>
           <w:tcPr>
-            <w:tcW w:type="dxa" w:w="1500"/>
+            <w:tcW w:type="dxa" w:w="1800"/>
           </w:tcPr>
           <w:p>
             <w:r>
               <w:rPr>
                 <w:sz w:val="19"/>
               </w:rPr>
-              <w:t>Classic frameworks and logs</w:t>
+              <w:t>Asset starvation</w:t>
             </w:r>
           </w:p>
         </w:tc>
         <w:tc>
           <w:tcPr>
-            <w:tcW w:type="dxa" w:w="3300"/>
+            <w:tcW w:type="dxa" w:w="3700"/>
           </w:tcPr>
           <w:p>
             <w:r>
               <w:rPr>
                 <w:sz w:val="19"/>
               </w:rPr>
-              <w:t>Cowrie, T-Pot, OpenCanary [42]; Schneier and Kelsey audit logs [43]</w:t>
+              <w:t>Drosera: no-assets behavior signal [27]. Others: not found in my search.</w:t>
             </w:r>
           </w:p>
         </w:tc>
         <w:tc>
           <w:tcPr>
-            <w:tcW w:type="dxa" w:w="4500"/>
+            <w:tcW w:type="dxa" w:w="3800"/>
           </w:tcPr>
           <w:p>
             <w:r>
               <w:rPr>
                 <w:sz w:val="19"/>
               </w:rPr>
-              <w:t>Any-touch alerting, aggregation and dashboards; hash-chained tamper-evident logs.</w:t>
+              <w:t>Yes. Since v4 it separates selective asset blocking from true starvation: a client that loads CSS or script, or sends coherent Sec-Fetch headers, is not flagged.</w:t>
+            </w:r>
+          </w:p>
+        </w:tc>
+      </w:tr>
+      <w:tr>
+        <w:trPr>
+          <w:cantSplit w:val="true"/>
+        </w:trPr>
+        <w:tc>
+          <w:tcPr>
+            <w:tcW w:type="dxa" w:w="1800"/>
+          </w:tcPr>
+          <w:p>
+            <w:r>
+              <w:rPr>
+                <w:sz w:val="19"/>
+              </w:rPr>
+              <w:t>Move checked against the links the page actually offered</w:t>
+            </w:r>
+          </w:p>
+        </w:tc>
+        <w:tc>
+          <w:tcPr>
+            <w:tcW w:type="dxa" w:w="3700"/>
+          </w:tcPr>
+          <w:p>
+            <w:r>
+              <w:rPr>
+                <w:sz w:val="19"/>
+              </w:rPr>
+              <w:t>Not found in my search.</w:t>
+            </w:r>
+          </w:p>
+        </w:tc>
+        <w:tc>
+          <w:tcPr>
+            <w:tcW w:type="dxa" w:w="3800"/>
+          </w:tcPr>
+          <w:p>
+            <w:r>
+              <w:rPr>
+                <w:sz w:val="19"/>
+              </w:rPr>
+              <w:t>Yes (unlinked jump), with an empirical fallback from Referer transitions when the log does not record offered links. The fallback is circular within one batch.</w:t>
+            </w:r>
+          </w:p>
+        </w:tc>
+      </w:tr>
+      <w:tr>
+        <w:trPr>
+          <w:cantSplit w:val="true"/>
+        </w:trPr>
+        <w:tc>
+          <w:tcPr>
+            <w:tcW w:type="dxa" w:w="1800"/>
+          </w:tcPr>
+          <w:p>
+            <w:r>
+              <w:rPr>
+                <w:sz w:val="19"/>
+              </w:rPr>
+              <w:t>Browser-backed mimics</w:t>
+            </w:r>
+          </w:p>
+        </w:tc>
+        <w:tc>
+          <w:tcPr>
+            <w:tcW w:type="dxa" w:w="3700"/>
+          </w:tcPr>
+          <w:p>
+            <w:r>
+              <w:rPr>
+                <w:sz w:val="19"/>
+              </w:rPr>
+              <w:t>FP-Agent and Fayolle et al. study client-side and multi-layer fingerprints [38][39]. Honeypot traps for this case: not found in my search.</w:t>
+            </w:r>
+          </w:p>
+        </w:tc>
+        <w:tc>
+          <w:tcPr>
+            <w:tcW w:type="dxa" w:w="3800"/>
+          </w:tcPr>
+          <w:p>
+            <w:r>
+              <w:rPr>
+                <w:sz w:val="19"/>
+              </w:rPr>
+              <w:t>ARIA canary plus a beacon of three booleans (no identifiers). Catches simulated mimics that fetch our script but never run it. JavaScript-disabled and beacon-blocking people produce no beacon: a known false positive.</w:t>
+            </w:r>
+          </w:p>
+        </w:tc>
+      </w:tr>
+      <w:tr>
+        <w:trPr>
+          <w:cantSplit w:val="true"/>
+        </w:trPr>
+        <w:tc>
+          <w:tcPr>
+            <w:tcW w:type="dxa" w:w="1800"/>
+          </w:tcPr>
+          <w:p>
+            <w:r>
+              <w:rPr>
+                <w:sz w:val="19"/>
+              </w:rPr>
+              <w:t>Harness archetype labels</w:t>
+            </w:r>
+          </w:p>
+        </w:tc>
+        <w:tc>
+          <w:tcPr>
+            <w:tcW w:type="dxa" w:w="3700"/>
+          </w:tcPr>
+          <w:p>
+            <w:r>
+              <w:rPr>
+                <w:sz w:val="19"/>
+              </w:rPr>
+              <w:t>Model attribution from action traces [40]. Deterministic archetype labels for web agents: not found in my search.</w:t>
+            </w:r>
+          </w:p>
+        </w:tc>
+        <w:tc>
+          <w:tcPr>
+            <w:tcW w:type="dxa" w:w="3800"/>
+          </w:tcPr>
+          <w:p>
+            <w:r>
+              <w:rPr>
+                <w:sz w:val="19"/>
+              </w:rPr>
+              <w:t>Six archetypes plus unclassified, each with plain-language reasons; descriptive, never scored.</w:t>
+            </w:r>
+          </w:p>
+        </w:tc>
+      </w:tr>
+      <w:tr>
+        <w:trPr>
+          <w:cantSplit w:val="true"/>
+        </w:trPr>
+        <w:tc>
+          <w:tcPr>
+            <w:tcW w:type="dxa" w:w="1800"/>
+          </w:tcPr>
+          <w:p>
+            <w:r>
+              <w:rPr>
+                <w:sz w:val="19"/>
+              </w:rPr>
+              <w:t>Downstream pipeline</w:t>
+            </w:r>
+          </w:p>
+        </w:tc>
+        <w:tc>
+          <w:tcPr>
+            <w:tcW w:type="dxa" w:w="3700"/>
+          </w:tcPr>
+          <w:p>
+            <w:r>
+              <w:rPr>
+                <w:sz w:val="19"/>
+              </w:rPr>
+              <w:t>Drosera documents noisy-OR fusion, log replay and a STIX report format [27]. A pipeline combining anomaly, rules, graph, audit chain and STIX: not found in my search.</w:t>
+            </w:r>
+          </w:p>
+        </w:tc>
+        <w:tc>
+          <w:tcPr>
+            <w:tcW w:type="dxa" w:w="3800"/>
+          </w:tcPr>
+          <w:p>
+            <w:r>
+              <w:rPr>
+                <w:sz w:val="19"/>
+              </w:rPr>
+              <w:t>Isolation Forest, rules, coordination graph, a two-signal corroboration gate, per-layer attribution, hash-chained audit log, STIX 2.1.</w:t>
+            </w:r>
+          </w:p>
+        </w:tc>
+      </w:tr>
+      <w:tr>
+        <w:trPr>
+          <w:cantSplit w:val="true"/>
+        </w:trPr>
+        <w:tc>
+          <w:tcPr>
+            <w:tcW w:type="dxa" w:w="1800"/>
+          </w:tcPr>
+          <w:p>
+            <w:r>
+              <w:rPr>
+                <w:sz w:val="19"/>
+              </w:rPr>
+              <w:t>TLS and header fingerprints</w:t>
+            </w:r>
+          </w:p>
+        </w:tc>
+        <w:tc>
+          <w:tcPr>
+            <w:tcW w:type="dxa" w:w="3700"/>
+          </w:tcPr>
+          <w:p>
+            <w:r>
+              <w:rPr>
+                <w:sz w:val="19"/>
+              </w:rPr>
+              <w:t>JA3/JA4 [37]; Fayolle et al. [39]. Documented.</w:t>
+            </w:r>
+          </w:p>
+        </w:tc>
+        <w:tc>
+          <w:tcPr>
+            <w:tcW w:type="dxa" w:w="3800"/>
+          </w:tcPr>
+          <w:p>
+            <w:r>
+              <w:rPr>
+                <w:sz w:val="19"/>
+              </w:rPr>
+              <w:t>Not implemented (a parse-only field).</w:t>
+            </w:r>
+          </w:p>
+        </w:tc>
+      </w:tr>
+      <w:tr>
+        <w:trPr>
+          <w:cantSplit w:val="true"/>
+        </w:trPr>
+        <w:tc>
+          <w:tcPr>
+            <w:tcW w:type="dxa" w:w="1800"/>
+          </w:tcPr>
+          <w:p>
+            <w:r>
+              <w:rPr>
+                <w:sz w:val="19"/>
+              </w:rPr>
+              <w:t>Real-world evidence</w:t>
+            </w:r>
+          </w:p>
+        </w:tc>
+        <w:tc>
+          <w:tcPr>
+            <w:tcW w:type="dxa" w:w="3700"/>
+          </w:tcPr>
+          <w:p>
+            <w:r>
+              <w:rPr>
+                <w:sz w:val="19"/>
+              </w:rPr>
+              <w:t>Palisade: about 8.1 million real attempts [26]; Li et al. [41].</w:t>
+            </w:r>
+          </w:p>
+        </w:tc>
+        <w:tc>
+          <w:tcPr>
+            <w:tcW w:type="dxa" w:w="3800"/>
+          </w:tcPr>
+          <w:p>
+            <w:r>
+              <w:rPr>
+                <w:sz w:val="19"/>
+              </w:rPr>
+              <w:t>None. Localhost and synthetic only.</w:t>
             </w:r>
           </w:p>
         </w:tc>
@@ -1902,7 +2181,7 @@
         <w:t xml:space="preserve">Not novel. </w:t>
       </w:r>
       <w:r>
-        <w:t>Prior art covers the hidden-instruction canary page [26][27], the signed per-session token and the nonce round-trip [27], the coordination board's request that an agent disclose its task, tools and identity [29][26], the decoy OpenAPI and llms.txt documents [27][28], the decoy MCP endpoint with a tools/list-then-call signal [28][30][31], invisible-link traps [35], asset starvation as a signal [27], timing [26], and, on the pipeline side, the hash-chained log [43], Isolation Forest [13], the coordination graph [6] and STIX export [22]. Drosera [27], Sundew [28], MCP Decoy [31] and the Thinkst products [29][30] are the nearest matches, and our honeypot side should be described as a reimplementation of these ideas, not a new technique.</w:t>
+        <w:t>Prior art covers the hidden-instruction canary page [26][27], the signed per-session token and the nonce round-trip [27], the coordination board's request that an agent disclose its task, tools and identity [29][26], the decoy OpenAPI and llms.txt documents [27][28], the decoy MCP endpoint with a tools/list-then-call signal [28][30][31], invisible-link traps [35], asset starvation as a signal [27], timing [26], and, on the pipeline side, the hash-chained log [43], Isolation Forest [13], the coordination graph [6] and STIX export [22]. Drosera [27], Sundew [28], MCP Decoy [31] and the Thinkst products [29][30] are the nearest matches, and our honeypot side should be described as a reimplementation of these ideas plus extensions, not a new technique.</w:t>
       </w:r>
     </w:p>
     <w:p>
@@ -1911,10 +2190,10 @@
         <w:rPr>
           <w:b/>
         </w:rPr>
-        <w:t xml:space="preserve">Possibly new, and unproven. </w:t>
+        <w:t xml:space="preserve">Where this stack extends prior art (possibly new, unproven). </w:t>
       </w:r>
       <w:r>
-        <w:t>(1) The integration: a honeypot and log detector whose pseudonymized output feeds a separate pipeline with an anomaly layer, rule gates, a coordination graph, an audit chain and STIX export. The search found each half in separate projects but no project doing both. (2) Three small mechanisms for which the search found no equivalent: scoring each page move against the link graph the honeypot actually served (unlinked jumps), a handoff token replayed from a different session or address as a coordination signal, and a capped multi-step claim loop on the board. (3) Reporting practice: evaders and false positives are stated, and a lone decoy hit is labeled an accidental scraper, not an agent. Finding no equivalent is not proof that none exists.</w:t>
+        <w:t>(1) Selective blocking versus starvation: the asset-starvation signal is typed by what was skipped, which removed the false positive for people who block images (in the agent-watch simulation, 15 of 15 such clients were alerted in v3 and 0 of 15 in v4). (2) Link-graph and trap evidence for browser-backed mimics: each page move is scored against the links the honeypot actually served, with an empirical fallback for ordinary logs, and an ARIA canary plus a three-boolean beacon target clients that look like browsers. In the 135-client pipeline simulation (9 mimic cohorts over 5 seeds) the share producing a lead rose from 0 percent in v2 to 33 percent in v3 and 78 percent in v4 (105 of 135). The cohort that loads CSS and script and sends correct headers (mimic_assets) went from 0 of 15 to 15 of 15, but only because the simulated mimic fetches our script and never runs it; two evaders (a stealth browser and a header forger) are still missed, 0 of 15 each. (3) Coordination and harness evidence: a handoff token replayed from a different session or address, a capped claim loop, and a deterministic harness-archetype label with reasons. (4) Integration and honest reporting: the pseudonymized output feeds a separate pipeline with a two-signal corroboration gate and per-layer attribution of every lead. The search found each half in separate projects but no project doing both; finding no equivalent is not proof that none exists.</w:t>
       </w:r>
     </w:p>
     <w:p>
@@ -1923,10 +2202,22 @@
         <w:rPr>
           <w:b/>
         </w:rPr>
-        <w:t xml:space="preserve">What we lack. </w:t>
+        <w:t xml:space="preserve">What the extensions cost. </w:t>
       </w:r>
       <w:r>
-        <w:t>All our figures come from same-author synthetic data. Palisade reports about 8.1 million real attempts [26] and the Li et al. honeysites 26.4 million requests [41]. We have no fingerprint layer, although measurement studies find multi-layer fingerprints and client-side behavior strongly discriminative [38][39]; some agents bypassed every defense tested [39], like our own undetected mimic.</w:t>
+        <w:t>The beacon rule produces false positives on people whose script is blocked: 15 of 15 simulated beacon-blocking humans and 10 of 10 no-asset, no-Sec-Fetch humans received a weak lead. The corroboration gate removed 11 statistical-only benign leads (7 compliance scanners, 4 noisy-denied clients) in the standard scenario set and lowered the false-positive rate from 0.06 to 0.04, at the price of 2 injected probers and, in the all-evasive set, all recall that depended on Isolation Forest and the sequence model alone (core recall 0.24 to 0.00). Both trade-offs are reported in the project READMEs.</w:t>
+      </w:r>
+    </w:p>
+    <w:p>
+      <w:pPr/>
+      <w:r>
+        <w:rPr>
+          <w:b/>
+        </w:rPr>
+        <w:t xml:space="preserve">Honest evaluation boundaries. </w:t>
+      </w:r>
+      <w:r>
+        <w:t>All figures are synthetic same-author regression checks, not benchmarks: the simulated clients, including each mimic, were written by the same author as the detectors, with the rules in mind. A honeypot or beacon contact shows contact, not intent. Every output is a lead for human review; nothing blocks or accuses anyone. Palisade reports about 8.1 million real attempts [26] and the Li et al. honeysites 26.4 million requests [41]; we have no real traffic, no real browser or agent was driven against the code, and no TLS fingerprint layer, although measurement studies find multi-layer fingerprints strongly discriminative [38][39] and some agents bypassed every defense tested [39].</w:t>
       </w:r>
     </w:p>
     <w:p>
@@ -1979,7 +2270,7 @@
         <w:spacing w:after="60"/>
       </w:pPr>
       <w:r>
-        <w:t>The related-work search in section 9 used web search on 23 October 2026; for GitHub projects the README was read, not the code, and none was run. Several projects are weeks or months old and may change.</w:t>
+        <w:t>The related-work search in section 9 was a limited public web search on 23 October 2026, not a systematic review; for GitHub projects the README was read, not the code, and none was run. Where a capability is marked “not found in my search” it may still exist. Several projects are weeks or months old and may change. The v3 to v5 figures come from simulated clients written by the same author as the detectors.</w:t>
       </w:r>
     </w:p>
     <w:p>
@@ -2527,7 +2818,7 @@
         <w:rPr>
           <w:sz w:val="18"/>
         </w:rPr>
-        <w:t>[45] Project file prior-art.md (prior-art table with dates, verification notes and unverified items), 23 Oct 2026.</w:t>
+        <w:t>[45] Project file docs/prior-art.md (prior-art table with dates, verification notes and unverified items), 23 Oct 2026.</w:t>
       </w:r>
     </w:p>
     <w:sectPr>

</xml_diff>

<commit_message>
Replace the whitepaper with the 23 October 2026 copy-edit.
The rebuilt PDF is 10 pages and the title line is dated 23 October 2026. Record the v4/v5 test counts from this branch: agent-watch 447 passed with pydantic present, pipeline 331 passed, mypy clean.

Co-authored-by: freeling10-prog <freeling10-prog@users.noreply.github.com>
</commit_message>
<xml_diff>
--- a/docs/rogue-ai-detection-whitepaper.docx
+++ b/docs/rogue-ai-detection-whitepaper.docx
@@ -29,7 +29,7 @@
           <w:i/>
           <w:sz w:val="19"/>
         </w:rPr>
-        <w:t>Whitepaper  |  22 October 2026  |  Companion to the methods report and the Python prototype</w:t>
+        <w:t>Whitepaper  |  23 October 2026  |  Companion to the methods report and the Python prototype</w:t>
       </w:r>
     </w:p>
     <w:tbl>
@@ -42,6 +42,9 @@
         <w:gridCol w:w="9632"/>
       </w:tblGrid>
       <w:tr>
+        <w:trPr>
+          <w:cantSplit w:val="true"/>
+        </w:trPr>
         <w:tc>
           <w:tcPr>
             <w:tcW w:type="dxa" w:w="9632"/>
@@ -234,18 +237,30 @@
         <w:tblW w:type="auto" w:w="0"/>
         <w:jc w:val="center"/>
         <w:tblLook w:firstColumn="1" w:firstRow="1" w:lastColumn="0" w:lastRow="0" w:noHBand="0" w:noVBand="1" w:val="04A0"/>
+        <w:tblCellMar>
+          <w:top w:w="0" w:type="dxa"/>
+          <w:bottom w:w="0" w:type="dxa"/>
+          <w:left w:w="85" w:type="dxa"/>
+          <w:right w:w="85" w:type="dxa"/>
+        </w:tblCellMar>
       </w:tblPr>
       <w:tblGrid>
         <w:gridCol w:w="4816"/>
         <w:gridCol w:w="4816"/>
       </w:tblGrid>
       <w:tr>
+        <w:trPr>
+          <w:cantSplit w:val="true"/>
+        </w:trPr>
         <w:tc>
           <w:tcPr>
             <w:tcW w:type="dxa" w:w="2948"/>
             <w:shd w:val="clear" w:color="auto" w:fill="E8E8EC"/>
           </w:tcPr>
           <w:p>
+            <w:pPr>
+              <w:spacing w:before="0" w:after="20"/>
+            </w:pPr>
             <w:r/>
             <w:r>
               <w:rPr>
@@ -262,6 +277,9 @@
             <w:shd w:val="clear" w:color="auto" w:fill="E8E8EC"/>
           </w:tcPr>
           <w:p>
+            <w:pPr>
+              <w:spacing w:before="0" w:after="20"/>
+            </w:pPr>
             <w:r/>
             <w:r>
               <w:rPr>
@@ -274,11 +292,17 @@
         </w:tc>
       </w:tr>
       <w:tr>
+        <w:trPr>
+          <w:cantSplit w:val="true"/>
+        </w:trPr>
         <w:tc>
           <w:tcPr>
             <w:tcW w:type="dxa" w:w="2948"/>
           </w:tcPr>
           <w:p>
+            <w:pPr>
+              <w:spacing w:before="0" w:after="20"/>
+            </w:pPr>
             <w:r/>
             <w:r>
               <w:rPr>
@@ -293,6 +317,9 @@
             <w:tcW w:type="dxa" w:w="6350"/>
           </w:tcPr>
           <w:p>
+            <w:pPr>
+              <w:spacing w:before="0" w:after="20"/>
+            </w:pPr>
             <w:r/>
             <w:r>
               <w:rPr>
@@ -304,11 +331,17 @@
         </w:tc>
       </w:tr>
       <w:tr>
+        <w:trPr>
+          <w:cantSplit w:val="true"/>
+        </w:trPr>
         <w:tc>
           <w:tcPr>
             <w:tcW w:type="dxa" w:w="2948"/>
           </w:tcPr>
           <w:p>
+            <w:pPr>
+              <w:spacing w:before="0" w:after="20"/>
+            </w:pPr>
             <w:r/>
             <w:r>
               <w:rPr>
@@ -323,6 +356,9 @@
             <w:tcW w:type="dxa" w:w="6350"/>
           </w:tcPr>
           <w:p>
+            <w:pPr>
+              <w:spacing w:before="0" w:after="20"/>
+            </w:pPr>
             <w:r/>
             <w:r>
               <w:rPr>
@@ -334,11 +370,17 @@
         </w:tc>
       </w:tr>
       <w:tr>
+        <w:trPr>
+          <w:cantSplit w:val="true"/>
+        </w:trPr>
         <w:tc>
           <w:tcPr>
             <w:tcW w:type="dxa" w:w="2948"/>
           </w:tcPr>
           <w:p>
+            <w:pPr>
+              <w:spacing w:before="0" w:after="20"/>
+            </w:pPr>
             <w:r/>
             <w:r>
               <w:rPr>
@@ -353,6 +395,9 @@
             <w:tcW w:type="dxa" w:w="6350"/>
           </w:tcPr>
           <w:p>
+            <w:pPr>
+              <w:spacing w:before="0" w:after="20"/>
+            </w:pPr>
             <w:r/>
             <w:r>
               <w:rPr>
@@ -364,11 +409,17 @@
         </w:tc>
       </w:tr>
       <w:tr>
+        <w:trPr>
+          <w:cantSplit w:val="true"/>
+        </w:trPr>
         <w:tc>
           <w:tcPr>
             <w:tcW w:type="dxa" w:w="2948"/>
           </w:tcPr>
           <w:p>
+            <w:pPr>
+              <w:spacing w:before="0" w:after="20"/>
+            </w:pPr>
             <w:r/>
             <w:r>
               <w:rPr>
@@ -383,6 +434,9 @@
             <w:tcW w:type="dxa" w:w="6350"/>
           </w:tcPr>
           <w:p>
+            <w:pPr>
+              <w:spacing w:before="0" w:after="20"/>
+            </w:pPr>
             <w:r/>
             <w:r>
               <w:rPr>
@@ -394,11 +448,17 @@
         </w:tc>
       </w:tr>
       <w:tr>
+        <w:trPr>
+          <w:cantSplit w:val="true"/>
+        </w:trPr>
         <w:tc>
           <w:tcPr>
             <w:tcW w:type="dxa" w:w="2948"/>
           </w:tcPr>
           <w:p>
+            <w:pPr>
+              <w:spacing w:before="0" w:after="20"/>
+            </w:pPr>
             <w:r/>
             <w:r>
               <w:rPr>
@@ -413,6 +473,9 @@
             <w:tcW w:type="dxa" w:w="6350"/>
           </w:tcPr>
           <w:p>
+            <w:pPr>
+              <w:spacing w:before="0" w:after="20"/>
+            </w:pPr>
             <w:r/>
             <w:r>
               <w:rPr>
@@ -424,11 +487,17 @@
         </w:tc>
       </w:tr>
       <w:tr>
+        <w:trPr>
+          <w:cantSplit w:val="true"/>
+        </w:trPr>
         <w:tc>
           <w:tcPr>
             <w:tcW w:type="dxa" w:w="2948"/>
           </w:tcPr>
           <w:p>
+            <w:pPr>
+              <w:spacing w:before="0" w:after="20"/>
+            </w:pPr>
             <w:r/>
             <w:r>
               <w:rPr>
@@ -443,6 +512,9 @@
             <w:tcW w:type="dxa" w:w="6350"/>
           </w:tcPr>
           <w:p>
+            <w:pPr>
+              <w:spacing w:before="0" w:after="20"/>
+            </w:pPr>
             <w:r/>
             <w:r>
               <w:rPr>
@@ -535,6 +607,9 @@
         <w:gridCol w:w="2408"/>
       </w:tblGrid>
       <w:tr>
+        <w:trPr>
+          <w:cantSplit w:val="true"/>
+        </w:trPr>
         <w:tc>
           <w:tcPr>
             <w:tcW w:type="dxa" w:w="3515"/>
@@ -601,6 +676,9 @@
         </w:tc>
       </w:tr>
       <w:tr>
+        <w:trPr>
+          <w:cantSplit w:val="true"/>
+        </w:trPr>
         <w:tc>
           <w:tcPr>
             <w:tcW w:type="dxa" w:w="3515"/>
@@ -659,6 +737,9 @@
         </w:tc>
       </w:tr>
       <w:tr>
+        <w:trPr>
+          <w:cantSplit w:val="true"/>
+        </w:trPr>
         <w:tc>
           <w:tcPr>
             <w:tcW w:type="dxa" w:w="3515"/>
@@ -717,6 +798,9 @@
         </w:tc>
       </w:tr>
       <w:tr>
+        <w:trPr>
+          <w:cantSplit w:val="true"/>
+        </w:trPr>
         <w:tc>
           <w:tcPr>
             <w:tcW w:type="dxa" w:w="3515"/>
@@ -775,6 +859,9 @@
         </w:tc>
       </w:tr>
       <w:tr>
+        <w:trPr>
+          <w:cantSplit w:val="true"/>
+        </w:trPr>
         <w:tc>
           <w:tcPr>
             <w:tcW w:type="dxa" w:w="3515"/>
@@ -908,6 +995,9 @@
         <w:gridCol w:w="4816"/>
       </w:tblGrid>
       <w:tr>
+        <w:trPr>
+          <w:cantSplit w:val="true"/>
+        </w:trPr>
         <w:tc>
           <w:tcPr>
             <w:tcW w:type="dxa" w:w="2494"/>
@@ -942,6 +1032,9 @@
         </w:tc>
       </w:tr>
       <w:tr>
+        <w:trPr>
+          <w:cantSplit w:val="true"/>
+        </w:trPr>
         <w:tc>
           <w:tcPr>
             <w:tcW w:type="dxa" w:w="2494"/>
@@ -972,6 +1065,9 @@
         </w:tc>
       </w:tr>
       <w:tr>
+        <w:trPr>
+          <w:cantSplit w:val="true"/>
+        </w:trPr>
         <w:tc>
           <w:tcPr>
             <w:tcW w:type="dxa" w:w="2494"/>
@@ -1002,6 +1098,9 @@
         </w:tc>
       </w:tr>
       <w:tr>
+        <w:trPr>
+          <w:cantSplit w:val="true"/>
+        </w:trPr>
         <w:tc>
           <w:tcPr>
             <w:tcW w:type="dxa" w:w="2494"/>
@@ -1032,6 +1131,9 @@
         </w:tc>
       </w:tr>
       <w:tr>
+        <w:trPr>
+          <w:cantSplit w:val="true"/>
+        </w:trPr>
         <w:tc>
           <w:tcPr>
             <w:tcW w:type="dxa" w:w="2494"/>
@@ -1062,6 +1164,9 @@
         </w:tc>
       </w:tr>
       <w:tr>
+        <w:trPr>
+          <w:cantSplit w:val="true"/>
+        </w:trPr>
         <w:tc>
           <w:tcPr>
             <w:tcW w:type="dxa" w:w="2494"/>
@@ -1092,6 +1197,9 @@
         </w:tc>
       </w:tr>
       <w:tr>
+        <w:trPr>
+          <w:cantSplit w:val="true"/>
+        </w:trPr>
         <w:tc>
           <w:tcPr>
             <w:tcW w:type="dxa" w:w="2494"/>
@@ -1122,6 +1230,9 @@
         </w:tc>
       </w:tr>
       <w:tr>
+        <w:trPr>
+          <w:cantSplit w:val="true"/>
+        </w:trPr>
         <w:tc>
           <w:tcPr>
             <w:tcW w:type="dxa" w:w="2494"/>
@@ -1152,6 +1263,9 @@
         </w:tc>
       </w:tr>
       <w:tr>
+        <w:trPr>
+          <w:cantSplit w:val="true"/>
+        </w:trPr>
         <w:tc>
           <w:tcPr>
             <w:tcW w:type="dxa" w:w="2494"/>
@@ -1297,6 +1411,9 @@
         <w:gridCol w:w="3211"/>
       </w:tblGrid>
       <w:tr>
+        <w:trPr>
+          <w:cantSplit w:val="true"/>
+        </w:trPr>
         <w:tc>
           <w:tcPr>
             <w:tcW w:type="dxa" w:w="2608"/>
@@ -1347,6 +1464,9 @@
         </w:tc>
       </w:tr>
       <w:tr>
+        <w:trPr>
+          <w:cantSplit w:val="true"/>
+        </w:trPr>
         <w:tc>
           <w:tcPr>
             <w:tcW w:type="dxa" w:w="2608"/>
@@ -1391,6 +1511,9 @@
         </w:tc>
       </w:tr>
       <w:tr>
+        <w:trPr>
+          <w:cantSplit w:val="true"/>
+        </w:trPr>
         <w:tc>
           <w:tcPr>
             <w:tcW w:type="dxa" w:w="2608"/>
@@ -1435,6 +1558,9 @@
         </w:tc>
       </w:tr>
       <w:tr>
+        <w:trPr>
+          <w:cantSplit w:val="true"/>
+        </w:trPr>
         <w:tc>
           <w:tcPr>
             <w:tcW w:type="dxa" w:w="2608"/>
@@ -1479,6 +1605,9 @@
         </w:tc>
       </w:tr>
       <w:tr>
+        <w:trPr>
+          <w:cantSplit w:val="true"/>
+        </w:trPr>
         <w:tc>
           <w:tcPr>
             <w:tcW w:type="dxa" w:w="2608"/>

</xml_diff>

<commit_message>
Document v6 and Phase 1-3 status in the whitepaper and README.
Extend the 23 October paper with the paired v6 regression check, the loopback Tier-2 catch rate, and the lab gateway and offline analyzer, and point the root README at those packages without claiming a wild deployment.

Co-authored-by: freeling10-prog <freeling10-prog@users.noreply.github.com>
</commit_message>
<xml_diff>
--- a/docs/rogue-ai-detection-whitepaper.docx
+++ b/docs/rogue-ai-detection-whitepaper.docx
@@ -29,7 +29,7 @@
           <w:i/>
           <w:sz w:val="19"/>
         </w:rPr>
-        <w:t>Whitepaper  |  23 October 2026  |  Companion to the methods report and the Python prototype</w:t>
+        <w:t>Whitepaper  |  24 October 2026  |  Companion to the methods report and the Python prototype. v6 and Phases 1 to 3 added; the 23 October 2026 text stands where it is not revised here.</w:t>
       </w:r>
     </w:p>
     <w:tbl>
@@ -56,7 +56,7 @@
               <w:rPr>
                 <w:sz w:val="20"/>
               </w:rPr>
-              <w:t>Data notice: the prototype described in this paper runs only on synthetic data generated by the project. No real platform, account or person was scraped or analyzed. Prototype results show that the pipeline works; they are not evidence of real-world detection accuracy.</w:t>
+              <w:t>Data notice: the prototype described in this paper runs only on synthetic data generated by the project. No real platform, account or person was scraped or analyzed. Prototype results show that the pipeline works; they are not evidence of real-world detection accuracy. A later loopback sample (section 4) drives a local model and Playwright against 127.0.0.1 only. That sample is not wild traffic and is not a benchmark. The web honeypot does not auto-block visitors. A lab gateway can freeze only a registered internal key.</w:t>
             </w:r>
           </w:p>
         </w:tc>
@@ -118,6 +118,14 @@
       </w:pPr>
       <w:r>
         <w:t>Evasion is easy. The prototype's evasive variants dropped fused recall from 1.00 to 0.11 on synthetic data. Published work also shows that LLM-based detectors can be attacked [10].</w:t>
+      </w:r>
+    </w:p>
+    <w:p>
+      <w:pPr>
+        <w:pStyle w:val="ListBullet"/>
+      </w:pPr>
+      <w:r>
+        <w:t>Synthetic scores overstate a small local model. On archived loopback runs of qwen2.5:3b against the v6 honeypot, 2 of 13 non-control sessions were caught. The model usually stopped after 1 to 3 tool calls, so deeper traps (the decoy MCP path, the coordination board, provenance cursors) rarely had a request to score. The web honeypot still only raises a lead for a person. See section 4.</w:t>
       </w:r>
     </w:p>
     <w:p>
@@ -940,13 +948,947 @@
           <w:b/>
           <w:i w:val="0"/>
         </w:rPr>
-        <w:t xml:space="preserve">Later versions (v3 to v5). </w:t>
+        <w:t>Later versions (v3 to v5). The companion code grew into two projects. agent-watch is a localhost-only honeypot and log detector; rogue-ai-pipeline is the multi-layer scorer. v3 added a mirrored access stream, passive web detectors (asset starvation, unlinked jumps), score floors and a decoy MCP endpoint. v4 separated selective asset blocking from true starvation, added an ARIA canary and a three-boolean interaction beacon for browser-backed mimics, a two-signal corroboration gate, per-layer attribution of benign leads, an empirical link-graph fallback and an encoded-secret scrubber port. v5 adds a deterministic harness fingerprint (six archetypes, each with reasons and a low, medium or high confidence that describes how much of the signature was seen) and a static, escaped HTML replay page for human reviewers. On 23 October 2026 the recorded test status was agent-watch 446 passed and 1 skipped, rogue-ai-pipeline 331 passed, pipeline type checks clean. These are regression checks on synthetic data. v6 and the later packages are below.</w:t>
       </w:r>
       <w:r>
         <w:rPr>
           <w:b w:val="0"/>
         </w:rPr>
-        <w:t>The companion code has since grown into two projects. agent-watch is a localhost-only honeypot and log detector; rogue-ai-pipeline is the multi-layer scorer. v3 added a mirrored access stream, passive web detectors (asset starvation, unlinked jumps), score floors and a decoy MCP endpoint. v4 separated selective asset blocking from true starvation, added an ARIA canary and a three-boolean interaction beacon for browser-backed mimics, a two-signal corroboration gate, per-layer attribution of benign leads, an empirical link-graph fallback and an encoded-secret scrubber port. v5 adds a deterministic harness fingerprint (six archetypes, each with reasons and a low, medium or high confidence that describes how much of the signature was seen) and a static, escaped HTML replay page for human reviewers. Current test status: agent-watch 446 passed and 1 skipped, rogue-ai-pipeline 331 passed, pipeline type checks clean. These are regression checks on synthetic data.</w:t>
+      </w:r>
+    </w:p>
+    <w:p>
+      <w:pPr>
+        <w:pStyle w:val="Heading2"/>
+      </w:pPr>
+      <w:r>
+        <w:t>v6 traps (synthetic regression)</w:t>
+      </w:r>
+    </w:p>
+    <w:p>
+      <w:r>
+        <w:t>v6, in both agent-watch and rogue-ai-pipeline, adds a challenge-bound browser beacon, a DOM-visual inversion trap, load-bearing provenance cursors, an R14 check for a parasitic session fork, and a static-refusal decoy for an LLM completion endpoint. The honeypot still binds to 127.0.0.1 by default and makes no outbound request. Every web lead stays a lead for human review. Nothing in the honeypot auto-blocks a visitor. The v6 write-up records agent-watch at 492 passed and 1 skipped, and the pipeline at 384 passed, with pipeline type checks clean [46]. Those counts are the regression run recorded with that write-up. This paper does not re-count the full suite.</w:t>
+      </w:r>
+    </w:p>
+    <w:p>
+      <w:r>
+        <w:t>The paired synthetic check uses clients written by the same author as the detectors. It is a regression check, not a benchmark. Headline contrasts, same traffic scored by the v5 and v6 trees [46]:</w:t>
+      </w:r>
+    </w:p>
+    <w:tbl>
+      <w:tblPr>
+        <w:tblStyle w:val="TableGrid"/>
+        <w:jc w:val="center"/>
+        <w:tblLook w:firstColumn="1" w:firstRow="1" w:lastColumn="0" w:lastRow="0" w:noHBand="0" w:noVBand="1" w:val="04A0"/>
+        <w:tblW w:type="auto" w:w="0"/>
+      </w:tblPr>
+      <w:tblGrid>
+        <w:gridCol w:w="3211"/>
+        <w:gridCol w:w="3211"/>
+        <w:gridCol w:w="3211"/>
+      </w:tblGrid>
+      <w:tr>
+        <w:tc>
+          <w:tcPr>
+            <w:tcW w:type="dxa" w:w="3211"/>
+          </w:tcPr>
+          <w:p>
+            <w:r>
+              <w:t>Paired synthetic check (same author)</w:t>
+            </w:r>
+          </w:p>
+        </w:tc>
+        <w:tc>
+          <w:tcPr>
+            <w:tcW w:type="dxa" w:w="3211"/>
+          </w:tcPr>
+          <w:p>
+            <w:r>
+              <w:t>v5</w:t>
+            </w:r>
+          </w:p>
+        </w:tc>
+        <w:tc>
+          <w:tcPr>
+            <w:tcW w:type="dxa" w:w="3211"/>
+          </w:tcPr>
+          <w:p>
+            <w:r>
+              <w:t>v6</w:t>
+            </w:r>
+          </w:p>
+        </w:tc>
+      </w:tr>
+      <w:tr>
+        <w:tc>
+          <w:tcPr>
+            <w:tcW w:type="dxa" w:w="3211"/>
+          </w:tcPr>
+          <w:p>
+            <w:r>
+              <w:t>agent-watch human alerts (five human cohorts)</w:t>
+            </w:r>
+          </w:p>
+        </w:tc>
+        <w:tc>
+          <w:tcPr>
+            <w:tcW w:type="dxa" w:w="3211"/>
+          </w:tcPr>
+          <w:p>
+            <w:r>
+              <w:t>15 of 75</w:t>
+            </w:r>
+          </w:p>
+        </w:tc>
+        <w:tc>
+          <w:tcPr>
+            <w:tcW w:type="dxa" w:w="3211"/>
+          </w:tcPr>
+          <w:p>
+            <w:r>
+              <w:t>0 of 75</w:t>
+            </w:r>
+          </w:p>
+        </w:tc>
+      </w:tr>
+      <w:tr>
+        <w:tc>
+          <w:tcPr>
+            <w:tcW w:type="dxa" w:w="3211"/>
+          </w:tcPr>
+          <w:p>
+            <w:r>
+              <w:t>Pipeline web false-positive rate</w:t>
+            </w:r>
+          </w:p>
+        </w:tc>
+        <w:tc>
+          <w:tcPr>
+            <w:tcW w:type="dxa" w:w="3211"/>
+          </w:tcPr>
+          <w:p>
+            <w:r>
+              <w:t>39 of 575 (0.068)</w:t>
+            </w:r>
+          </w:p>
+        </w:tc>
+        <w:tc>
+          <w:tcPr>
+            <w:tcW w:type="dxa" w:w="3211"/>
+          </w:tcPr>
+          <w:p>
+            <w:r>
+              <w:t>14 of 575 (0.024)</w:t>
+            </w:r>
+          </w:p>
+        </w:tc>
+      </w:tr>
+      <w:tr>
+        <w:tc>
+          <w:tcPr>
+            <w:tcW w:type="dxa" w:w="3211"/>
+          </w:tcPr>
+          <w:p>
+            <w:r>
+              <w:t>Pipeline core standard false-positive rate</w:t>
+            </w:r>
+          </w:p>
+        </w:tc>
+        <w:tc>
+          <w:tcPr>
+            <w:tcW w:type="dxa" w:w="3211"/>
+          </w:tcPr>
+          <w:p>
+            <w:r>
+              <w:t>21 of 605 (0.035)</w:t>
+            </w:r>
+          </w:p>
+        </w:tc>
+        <w:tc>
+          <w:tcPr>
+            <w:tcW w:type="dxa" w:w="3211"/>
+          </w:tcPr>
+          <w:p>
+            <w:r>
+              <w:t>21 of 605 (0.035)</w:t>
+            </w:r>
+          </w:p>
+        </w:tc>
+      </w:tr>
+      <w:tr>
+        <w:tc>
+          <w:tcPr>
+            <w:tcW w:type="dxa" w:w="3211"/>
+          </w:tcPr>
+          <w:p>
+            <w:r>
+              <w:t>All-evasive core recall (three original scenarios)</w:t>
+            </w:r>
+          </w:p>
+        </w:tc>
+        <w:tc>
+          <w:tcPr>
+            <w:tcW w:type="dxa" w:w="3211"/>
+          </w:tcPr>
+          <w:p>
+            <w:r>
+              <w:t>0 of 80</w:t>
+            </w:r>
+          </w:p>
+        </w:tc>
+        <w:tc>
+          <w:tcPr>
+            <w:tcW w:type="dxa" w:w="3211"/>
+          </w:tcPr>
+          <w:p>
+            <w:r>
+              <w:t>12 of 80</w:t>
+            </w:r>
+          </w:p>
+        </w:tc>
+      </w:tr>
+      <w:tr>
+        <w:tc>
+          <w:tcPr>
+            <w:tcW w:type="dxa" w:w="3211"/>
+          </w:tcPr>
+          <w:p>
+            <w:r>
+              <w:t>Pipeline leads, stealth browser and header forger</w:t>
+            </w:r>
+          </w:p>
+        </w:tc>
+        <w:tc>
+          <w:tcPr>
+            <w:tcW w:type="dxa" w:w="3211"/>
+          </w:tcPr>
+          <w:p>
+            <w:r>
+              <w:t>0 of 15 each</w:t>
+            </w:r>
+          </w:p>
+        </w:tc>
+        <w:tc>
+          <w:tcPr>
+            <w:tcW w:type="dxa" w:w="3211"/>
+          </w:tcPr>
+          <w:p>
+            <w:r>
+              <w:t>10 of 15 and 10 of 15</w:t>
+            </w:r>
+          </w:p>
+        </w:tc>
+      </w:tr>
+      <w:tr>
+        <w:tc>
+          <w:tcPr>
+            <w:tcW w:type="dxa" w:w="3211"/>
+          </w:tcPr>
+          <w:p>
+            <w:r>
+              <w:t>Pipeline leads, mimic_assets and mimic_linked_nosec</w:t>
+            </w:r>
+          </w:p>
+        </w:tc>
+        <w:tc>
+          <w:tcPr>
+            <w:tcW w:type="dxa" w:w="3211"/>
+          </w:tcPr>
+          <w:p>
+            <w:r>
+              <w:t>15 of 15 each</w:t>
+            </w:r>
+          </w:p>
+        </w:tc>
+        <w:tc>
+          <w:tcPr>
+            <w:tcW w:type="dxa" w:w="3211"/>
+          </w:tcPr>
+          <w:p>
+            <w:r>
+              <w:t>0 of 15 each (regression)</w:t>
+            </w:r>
+          </w:p>
+        </w:tc>
+      </w:tr>
+    </w:tbl>
+    <w:p/>
+    <w:p>
+      <w:r>
+        <w:t>The 12 of 80 all-evasive core detections are the access-prober cohort. Evasive exfiltration and the evasive collusion ring stay at 0. The two pipeline regressions are deliberate: in the v6 evidence those mimics look like the beacon-blocked and no-asset humans whose false positives v6 removed. agent-watch still labels mimic_assets as an agent in that simulation, by the beacon and the inversion trap. Catching a client the author wrote is expected. It is not evidence about a model the author did not write.</w:t>
+      </w:r>
+    </w:p>
+    <w:p>
+      <w:pPr>
+        <w:pStyle w:val="Heading2"/>
+      </w:pPr>
+      <w:r>
+        <w:t>Loopback Tier-2 sample (Phase 1)</w:t>
+      </w:r>
+    </w:p>
+    <w:p>
+      <w:r>
+        <w:t>Phase 1 ran the v6 honeypot on 127.0.0.1 with a local Ollama model, qwen2.5:3b (Q4_K_M), and with Playwright Chromium. There was no public deploy. The archive holds 14 scrubbed runs: 9 urllib tool-calling sessions (three prompts, three seeds), 4 Playwright agent or crawler runs, and 1 scripted human control. "Caught" here means an agent-watch severity of medium or above, or a pipeline lead. On the 13 archives that are not the human control, the catch rate is 2 of 13. The two catches are the headless Playwright crawler and one of the two LLM-driven Playwright runs. The nine urllib sessions were not caught. The scripted human control was not caught either, and it is not in the denominator. A second, larger local model was not run. That skip was about 5 GiB free RAM and no swap on the machine, not a finished multimodel result.</w:t>
+      </w:r>
+    </w:p>
+    <w:tbl>
+      <w:tblPr>
+        <w:tblStyle w:val="TableGrid"/>
+        <w:jc w:val="center"/>
+        <w:tblLook w:firstColumn="1" w:firstRow="1" w:lastColumn="0" w:lastRow="0" w:noHBand="0" w:noVBand="1" w:val="04A0"/>
+        <w:tblW w:type="auto" w:w="0"/>
+      </w:tblPr>
+      <w:tblGrid>
+        <w:gridCol w:w="3211"/>
+        <w:gridCol w:w="3211"/>
+        <w:gridCol w:w="3211"/>
+      </w:tblGrid>
+      <w:tr>
+        <w:tc>
+          <w:tcPr>
+            <w:tcW w:type="dxa" w:w="3211"/>
+          </w:tcPr>
+          <w:p>
+            <w:r>
+              <w:t>Archived Tier-2 slice (loopback, qwen2.5:3b)</w:t>
+            </w:r>
+          </w:p>
+        </w:tc>
+        <w:tc>
+          <w:tcPr>
+            <w:tcW w:type="dxa" w:w="3211"/>
+          </w:tcPr>
+          <w:p>
+            <w:r>
+              <w:t>Caught</w:t>
+            </w:r>
+          </w:p>
+        </w:tc>
+        <w:tc>
+          <w:tcPr>
+            <w:tcW w:type="dxa" w:w="3211"/>
+          </w:tcPr>
+          <w:p>
+            <w:r>
+              <w:t>What the sessions did</w:t>
+            </w:r>
+          </w:p>
+        </w:tc>
+      </w:tr>
+      <w:tr>
+        <w:tc>
+          <w:tcPr>
+            <w:tcW w:type="dxa" w:w="3211"/>
+          </w:tcPr>
+          <w:p>
+            <w:r>
+              <w:t>urllib tool-calling (9 runs)</w:t>
+            </w:r>
+          </w:p>
+        </w:tc>
+        <w:tc>
+          <w:tcPr>
+            <w:tcW w:type="dxa" w:w="3211"/>
+          </w:tcPr>
+          <w:p>
+            <w:r>
+              <w:t>0 of 9</w:t>
+            </w:r>
+          </w:p>
+        </w:tc>
+        <w:tc>
+          <w:tcPr>
+            <w:tcW w:type="dxa" w:w="3211"/>
+          </w:tcPr>
+          <w:p>
+            <w:r>
+              <w:t>Usually 1 to 3 fetch calls, then a stop. Benign, aggressive-audit and stealth prompts.</w:t>
+            </w:r>
+          </w:p>
+        </w:tc>
+      </w:tr>
+      <w:tr>
+        <w:tc>
+          <w:tcPr>
+            <w:tcW w:type="dxa" w:w="3211"/>
+          </w:tcPr>
+          <w:p>
+            <w:r>
+              <w:t>Playwright crawler and LLM browser (4 runs)</w:t>
+            </w:r>
+          </w:p>
+        </w:tc>
+        <w:tc>
+          <w:tcPr>
+            <w:tcW w:type="dxa" w:w="3211"/>
+          </w:tcPr>
+          <w:p>
+            <w:r>
+              <w:t>2 of 4</w:t>
+            </w:r>
+          </w:p>
+        </w:tc>
+        <w:tc>
+          <w:tcPr>
+            <w:tcW w:type="dxa" w:w="3211"/>
+          </w:tcPr>
+          <w:p>
+            <w:r>
+              <w:t>Headless crawler caught. One LLM browser caught on the inversion link; one LLM browser and one stealth-ish run not caught.</w:t>
+            </w:r>
+          </w:p>
+        </w:tc>
+      </w:tr>
+      <w:tr>
+        <w:tc>
+          <w:tcPr>
+            <w:tcW w:type="dxa" w:w="3211"/>
+          </w:tcPr>
+          <w:p>
+            <w:r>
+              <w:t>Non-control archives together</w:t>
+            </w:r>
+          </w:p>
+        </w:tc>
+        <w:tc>
+          <w:tcPr>
+            <w:tcW w:type="dxa" w:w="3211"/>
+          </w:tcPr>
+          <w:p>
+            <w:r>
+              <w:t>2 of 13</w:t>
+            </w:r>
+          </w:p>
+        </w:tc>
+        <w:tc>
+          <w:tcPr>
+            <w:tcW w:type="dxa" w:w="3211"/>
+          </w:tcPr>
+          <w:p>
+            <w:r>
+              <w:t>Report this row for Tier 2. Do not pool it with the synthetic recall above.</w:t>
+            </w:r>
+          </w:p>
+        </w:tc>
+      </w:tr>
+      <w:tr>
+        <w:tc>
+          <w:tcPr>
+            <w:tcW w:type="dxa" w:w="3211"/>
+          </w:tcPr>
+          <w:p>
+            <w:r>
+              <w:t>Scripted human control (1 run)</w:t>
+            </w:r>
+          </w:p>
+        </w:tc>
+        <w:tc>
+          <w:tcPr>
+            <w:tcW w:type="dxa" w:w="3211"/>
+          </w:tcPr>
+          <w:p>
+            <w:r>
+              <w:t>0 of 1</w:t>
+            </w:r>
+          </w:p>
+        </w:tc>
+        <w:tc>
+          <w:tcPr>
+            <w:tcW w:type="dxa" w:w="3211"/>
+          </w:tcPr>
+          <w:p>
+            <w:r>
+              <w:t>A scripted proxy, not a real person. Soft unlinked-jump and cursor advisories only. Excluded from the 2 of 13.</w:t>
+            </w:r>
+          </w:p>
+        </w:tc>
+      </w:tr>
+    </w:tbl>
+    <w:p/>
+    <w:p>
+      <w:r>
+        <w:t>Why the synthetic optimism does not show up here. The simulated aggressive client walks a long list of decoys. qwen2.5:3b usually quit after 1 to 3 steps. It fetched the front page, llms.txt or the OpenAPI document and answered. It rarely reached /mcp, the coordination board, or a provenance cursor, so those traps had nothing to fire on. A 3B CPU model is not a frontier computer-use agent. The prompts, decoys and detectors share an author lineage, and every request hit one loopback honeypot. The sample is too small to call an accuracy.</w:t>
+      </w:r>
+    </w:p>
+    <w:p>
+      <w:r>
+        <w:t>Two calibrations followed the first pass, because that pass produced false structure, not because the catch rate was disappointing [46]. R14 had treated the single-client Playwright crawler's own fast navigations, beside its own beacon, as a parasitic fork. Same-session R14 now requires a schema-provenance cursor on the rider (and interleaved depth on two disjoint subtrees). A bare unlinked jump from one client does not qualify. Re-analysis of the archived crawler no longer raises parasitic_session_fork. The crawler remains a lead on the other signals (agent-watch critical; pipeline rules R10 and R11). Separately, dwell under 12 ms is inconclusive for touch and for an operating-system tap: the beacon returns null rather than a failed human kinematic. Null does not corroborate the visual-language-model rule. A real phone was not tested. A scripted mouse control, with a longer press, was rechecked at 2 of 2 beacons with dwell marked true.</w:t>
+      </w:r>
+    </w:p>
+    <w:p>
+      <w:r>
+        <w:t>Playwright archives are the useful half of this sample for offline work. They record navigation, assets and beacons. The urllib traces are thin: a handful of tool calls and a stop. An offline rule needs a path, a referrer or a cursor in the log. The thin traces often have none of the deep-trap paths.</w:t>
+      </w:r>
+    </w:p>
+    <w:p>
+      <w:pPr>
+        <w:pStyle w:val="Heading2"/>
+      </w:pPr>
+      <w:r>
+        <w:t>Offline analyzer (Phase 3)</w:t>
+      </w:r>
+    </w:p>
+    <w:p>
+      <w:r>
+        <w:t>agentwatch-analyzer is a standalone command-line package. It reads static access logs the operator already has. It does not import the honeypot, bind a port, or make an outbound call. It scrubs, then writes a findings file, a static replay.html page, and a STIX 2.1 bundle. The package ships 12 Sigma rules and records 10 of 10 unit tests passed [46]. It is not a web application firewall, and it is not a substitute for the live honeypot.</w:t>
+      </w:r>
+    </w:p>
+    <w:p>
+      <w:r>
+        <w:t>Offline coverage is incomplete on purpose. Rules that need a beacon, a honeypot clock, or the internal gateway cannot be decided from a normal access log:</w:t>
+      </w:r>
+    </w:p>
+    <w:tbl>
+      <w:tblPr>
+        <w:tblStyle w:val="TableGrid"/>
+        <w:jc w:val="center"/>
+        <w:tblLook w:firstColumn="1" w:firstRow="1" w:lastColumn="0" w:lastRow="0" w:noHBand="0" w:noVBand="1" w:val="04A0"/>
+        <w:tblW w:type="auto" w:w="0"/>
+      </w:tblPr>
+      <w:tblGrid>
+        <w:gridCol w:w="3211"/>
+        <w:gridCol w:w="3211"/>
+        <w:gridCol w:w="3211"/>
+      </w:tblGrid>
+      <w:tr>
+        <w:tc>
+          <w:tcPr>
+            <w:tcW w:type="dxa" w:w="3211"/>
+          </w:tcPr>
+          <w:p>
+            <w:r>
+              <w:t>Rule</w:t>
+            </w:r>
+          </w:p>
+        </w:tc>
+        <w:tc>
+          <w:tcPr>
+            <w:tcW w:type="dxa" w:w="3211"/>
+          </w:tcPr>
+          <w:p>
+            <w:r>
+              <w:t>Offline?</w:t>
+            </w:r>
+          </w:p>
+        </w:tc>
+        <w:tc>
+          <w:tcPr>
+            <w:tcW w:type="dxa" w:w="3211"/>
+          </w:tcPr>
+          <w:p>
+            <w:r>
+              <w:t>What a static log can support</w:t>
+            </w:r>
+          </w:p>
+        </w:tc>
+      </w:tr>
+      <w:tr>
+        <w:tc>
+          <w:tcPr>
+            <w:tcW w:type="dxa" w:w="3211"/>
+          </w:tcPr>
+          <w:p>
+            <w:r>
+              <w:t>R8 asset starvation</w:t>
+            </w:r>
+          </w:p>
+        </w:tc>
+        <w:tc>
+          <w:tcPr>
+            <w:tcW w:type="dxa" w:w="3211"/>
+          </w:tcPr>
+          <w:p>
+            <w:r>
+              <w:t>Yes</w:t>
+            </w:r>
+          </w:p>
+        </w:tc>
+        <w:tc>
+          <w:tcPr>
+            <w:tcW w:type="dxa" w:w="3211"/>
+          </w:tcPr>
+          <w:p>
+            <w:r>
+              <w:t>A browser user-agent and HTML without CSS or script fetches.</w:t>
+            </w:r>
+          </w:p>
+        </w:tc>
+      </w:tr>
+      <w:tr>
+        <w:tc>
+          <w:tcPr>
+            <w:tcW w:type="dxa" w:w="3211"/>
+          </w:tcPr>
+          <w:p>
+            <w:r>
+              <w:t>R9 unlinked jump</w:t>
+            </w:r>
+          </w:p>
+        </w:tc>
+        <w:tc>
+          <w:tcPr>
+            <w:tcW w:type="dxa" w:w="3211"/>
+          </w:tcPr>
+          <w:p>
+            <w:r>
+              <w:t>Yes</w:t>
+            </w:r>
+          </w:p>
+        </w:tc>
+        <w:tc>
+          <w:tcPr>
+            <w:tcW w:type="dxa" w:w="3211"/>
+          </w:tcPr>
+          <w:p>
+            <w:r>
+              <w:t>Referer link graph. Stronger if a sitemap or recorded links are supplied.</w:t>
+            </w:r>
+          </w:p>
+        </w:tc>
+      </w:tr>
+      <w:tr>
+        <w:tc>
+          <w:tcPr>
+            <w:tcW w:type="dxa" w:w="3211"/>
+          </w:tcPr>
+          <w:p>
+            <w:r>
+              <w:t>R10 schema or machine-doc</w:t>
+            </w:r>
+          </w:p>
+        </w:tc>
+        <w:tc>
+          <w:tcPr>
+            <w:tcW w:type="dxa" w:w="3211"/>
+          </w:tcPr>
+          <w:p>
+            <w:r>
+              <w:t>Partial</w:t>
+            </w:r>
+          </w:p>
+        </w:tc>
+        <w:tc>
+          <w:tcPr>
+            <w:tcW w:type="dxa" w:w="3211"/>
+          </w:tcPr>
+          <w:p>
+            <w:r>
+              <w:t>Cursor, query, OpenAPI and llms.txt paths. Decoy kinds need the honeypot.</w:t>
+            </w:r>
+          </w:p>
+        </w:tc>
+      </w:tr>
+      <w:tr>
+        <w:tc>
+          <w:tcPr>
+            <w:tcW w:type="dxa" w:w="3211"/>
+          </w:tcPr>
+          <w:p>
+            <w:r>
+              <w:t>R11 beacon and mimic</w:t>
+            </w:r>
+          </w:p>
+        </w:tc>
+        <w:tc>
+          <w:tcPr>
+            <w:tcW w:type="dxa" w:w="3211"/>
+          </w:tcPr>
+          <w:p>
+            <w:r>
+              <w:t>No</w:t>
+            </w:r>
+          </w:p>
+        </w:tc>
+        <w:tc>
+          <w:tcPr>
+            <w:tcW w:type="dxa" w:w="3211"/>
+          </w:tcPr>
+          <w:p>
+            <w:r>
+              <w:t>Needs honeypot beacons, inversion, or visual-language-model fields.</w:t>
+            </w:r>
+          </w:p>
+        </w:tc>
+      </w:tr>
+      <w:tr>
+        <w:tc>
+          <w:tcPr>
+            <w:tcW w:type="dxa" w:w="3211"/>
+          </w:tcPr>
+          <w:p>
+            <w:r>
+              <w:t>R12 tool hijack</w:t>
+            </w:r>
+          </w:p>
+        </w:tc>
+        <w:tc>
+          <w:tcPr>
+            <w:tcW w:type="dxa" w:w="3211"/>
+          </w:tcPr>
+          <w:p>
+            <w:r>
+              <w:t>No</w:t>
+            </w:r>
+          </w:p>
+        </w:tc>
+        <w:tc>
+          <w:tcPr>
+            <w:tcW w:type="dxa" w:w="3211"/>
+          </w:tcPr>
+          <w:p>
+            <w:r>
+              <w:t>Needs agent-gateway or API telemetry.</w:t>
+            </w:r>
+          </w:p>
+        </w:tc>
+      </w:tr>
+      <w:tr>
+        <w:tc>
+          <w:tcPr>
+            <w:tcW w:type="dxa" w:w="3211"/>
+          </w:tcPr>
+          <w:p>
+            <w:r>
+              <w:t>R13 timing adaptation</w:t>
+            </w:r>
+          </w:p>
+        </w:tc>
+        <w:tc>
+          <w:tcPr>
+            <w:tcW w:type="dxa" w:w="3211"/>
+          </w:tcPr>
+          <w:p>
+            <w:r>
+              <w:t>No</w:t>
+            </w:r>
+          </w:p>
+        </w:tc>
+        <w:tc>
+          <w:tcPr>
+            <w:tcW w:type="dxa" w:w="3211"/>
+          </w:tcPr>
+          <w:p>
+            <w:r>
+              <w:t>Needs honeypot timing.</w:t>
+            </w:r>
+          </w:p>
+        </w:tc>
+      </w:tr>
+      <w:tr>
+        <w:tc>
+          <w:tcPr>
+            <w:tcW w:type="dxa" w:w="3211"/>
+          </w:tcPr>
+          <w:p>
+            <w:r>
+              <w:t>R14 session fork</w:t>
+            </w:r>
+          </w:p>
+        </w:tc>
+        <w:tc>
+          <w:tcPr>
+            <w:tcW w:type="dxa" w:w="3211"/>
+          </w:tcPr>
+          <w:p>
+            <w:r>
+              <w:t>Partial, advisory</w:t>
+            </w:r>
+          </w:p>
+        </w:tc>
+        <w:tc>
+          <w:tcPr>
+            <w:tcW w:type="dxa" w:w="3211"/>
+          </w:tcPr>
+          <w:p>
+            <w:r>
+              <w:t>Interleaved disjoint trees only. No human-beacon corroboration offline.</w:t>
+            </w:r>
+          </w:p>
+        </w:tc>
+      </w:tr>
+    </w:tbl>
+    <w:p/>
+    <w:p>
+      <w:r>
+        <w:t>A smoke run on Jordan's machine, against archived Tier-2 logs and the nginx fixture agentlike_nginx.log, wrote replay.html, findings, and a STIX bundle with validator_ok true. The validator can still warn on x_ custom properties and on approximate ATLAS tags. Those warnings are expected with this exporter. Match counts from that smoke, and no others:</w:t>
+      </w:r>
+    </w:p>
+    <w:tbl>
+      <w:tblPr>
+        <w:tblStyle w:val="TableGrid"/>
+        <w:jc w:val="center"/>
+        <w:tblLook w:firstColumn="1" w:firstRow="1" w:lastColumn="0" w:lastRow="0" w:noHBand="0" w:noVBand="1" w:val="04A0"/>
+        <w:tblW w:type="auto" w:w="0"/>
+      </w:tblPr>
+      <w:tblGrid>
+        <w:gridCol w:w="3211"/>
+        <w:gridCol w:w="3211"/>
+        <w:gridCol w:w="3211"/>
+      </w:tblGrid>
+      <w:tr>
+        <w:tc>
+          <w:tcPr>
+            <w:tcW w:type="dxa" w:w="3211"/>
+          </w:tcPr>
+          <w:p>
+            <w:r>
+              <w:t>Sample</w:t>
+            </w:r>
+          </w:p>
+        </w:tc>
+        <w:tc>
+          <w:tcPr>
+            <w:tcW w:type="dxa" w:w="3211"/>
+          </w:tcPr>
+          <w:p>
+            <w:r>
+              <w:t>Matches</w:t>
+            </w:r>
+          </w:p>
+        </w:tc>
+        <w:tc>
+          <w:tcPr>
+            <w:tcW w:type="dxa" w:w="3211"/>
+          </w:tcPr>
+          <w:p>
+            <w:r>
+              <w:t>Rules</w:t>
+            </w:r>
+          </w:p>
+        </w:tc>
+      </w:tr>
+      <w:tr>
+        <w:tc>
+          <w:tcPr>
+            <w:tcW w:type="dxa" w:w="3211"/>
+          </w:tcPr>
+          <w:p>
+            <w:r>
+              <w:t>Tier-2 aggressive urllib LLM</w:t>
+            </w:r>
+          </w:p>
+        </w:tc>
+        <w:tc>
+          <w:tcPr>
+            <w:tcW w:type="dxa" w:w="3211"/>
+          </w:tcPr>
+          <w:p>
+            <w:r>
+              <w:t>0</w:t>
+            </w:r>
+          </w:p>
+        </w:tc>
+        <w:tc>
+          <w:tcPr>
+            <w:tcW w:type="dxa" w:w="3211"/>
+          </w:tcPr>
+          <w:p>
+            <w:r>
+              <w:t>none</w:t>
+            </w:r>
+          </w:p>
+        </w:tc>
+      </w:tr>
+      <w:tr>
+        <w:tc>
+          <w:tcPr>
+            <w:tcW w:type="dxa" w:w="3211"/>
+          </w:tcPr>
+          <w:p>
+            <w:r>
+              <w:t>Tier-2 Playwright LLM s100</w:t>
+            </w:r>
+          </w:p>
+        </w:tc>
+        <w:tc>
+          <w:tcPr>
+            <w:tcW w:type="dxa" w:w="3211"/>
+          </w:tcPr>
+          <w:p>
+            <w:r>
+              <w:t>1</w:t>
+            </w:r>
+          </w:p>
+        </w:tc>
+        <w:tc>
+          <w:tcPr>
+            <w:tcW w:type="dxa" w:w="3211"/>
+          </w:tcPr>
+          <w:p>
+            <w:r>
+              <w:t>R9</w:t>
+            </w:r>
+          </w:p>
+        </w:tc>
+      </w:tr>
+      <w:tr>
+        <w:tc>
+          <w:tcPr>
+            <w:tcW w:type="dxa" w:w="3211"/>
+          </w:tcPr>
+          <w:p>
+            <w:r>
+              <w:t>Tier-2 Playwright crawler s100</w:t>
+            </w:r>
+          </w:p>
+        </w:tc>
+        <w:tc>
+          <w:tcPr>
+            <w:tcW w:type="dxa" w:w="3211"/>
+          </w:tcPr>
+          <w:p>
+            <w:r>
+              <w:t>2</w:t>
+            </w:r>
+          </w:p>
+        </w:tc>
+        <w:tc>
+          <w:tcPr>
+            <w:tcW w:type="dxa" w:w="3211"/>
+          </w:tcPr>
+          <w:p>
+            <w:r>
+              <w:t>R9 + R14 (advisory offline)</w:t>
+            </w:r>
+          </w:p>
+        </w:tc>
+      </w:tr>
+      <w:tr>
+        <w:tc>
+          <w:tcPr>
+            <w:tcW w:type="dxa" w:w="3211"/>
+          </w:tcPr>
+          <w:p>
+            <w:r>
+              <w:t>Fixture agentlike_nginx.log</w:t>
+            </w:r>
+          </w:p>
+        </w:tc>
+        <w:tc>
+          <w:tcPr>
+            <w:tcW w:type="dxa" w:w="3211"/>
+          </w:tcPr>
+          <w:p>
+            <w:r>
+              <w:t>3</w:t>
+            </w:r>
+          </w:p>
+        </w:tc>
+        <w:tc>
+          <w:tcPr>
+            <w:tcW w:type="dxa" w:w="3211"/>
+          </w:tcPr>
+          <w:p>
+            <w:r>
+              <w:t>R8, R9, R10</w:t>
+            </w:r>
+          </w:p>
+        </w:tc>
+      </w:tr>
+    </w:tbl>
+    <w:p/>
+    <w:p>
+      <w:r>
+        <w:t>The offline R14 hit on the crawler is the advisory form. It is not a return of the live R14 false positive removed in the Phase 1 calibration. Live rescoring of that archive does not raise parasitic_session_fork. Contact with a decoy path in a log is still contact, not intent.</w:t>
       </w:r>
     </w:p>
     <w:p>
@@ -972,7 +1914,7 @@
         <w:spacing w:after="60"/>
       </w:pPr>
       <w:r>
-        <w:t>Does not show: performance on real traffic, behavior under drift, or resistance to adaptive attackers. No such claim is made.</w:t>
+        <w:t>Does not show: performance on wild traffic, behavior under drift, or resistance to an attacker who adapts. The loopback sample shows that synthetic recall did not transfer to one small local model. It is not a benchmark. No wild deployment is claimed.</w:t>
       </w:r>
     </w:p>
     <w:p>
@@ -1379,6 +2321,29 @@
       </w:pPr>
       <w:r>
         <w:t>Share carefully. Exchange indicators in structured form with partners, after review and with personal data removed [22][23].</w:t>
+      </w:r>
+    </w:p>
+    <w:p>
+      <w:pPr>
+        <w:pStyle w:val="Heading2"/>
+      </w:pPr>
+      <w:r>
+        <w:t>Lab gateway for registered internal keys (Phase 2)</w:t>
+      </w:r>
+    </w:p>
+    <w:p>
+      <w:r>
+        <w:t>The controls above are the point of agent-gateway. It is a loopback policy proxy (pep.py) between an organization's own agent harness and JSON-RPC or MCP-style tool calls. The project maps it to MITRE ATLAS mitigation AML.M0030, restrict tool invocation on untrusted data: untrusted ingest taints the session, and a tainted call can be blocked or the key frozen [46]. The mapping is the project's, recorded in the Phase 2 note. This paper did not re-check that mitigation identifier against the ATLAS data file.</w:t>
+      </w:r>
+    </w:p>
+    <w:p>
+      <w:r>
+        <w:t>The safety split is the whole design. The web honeypot stays human-review only and does not auto-block a public visitor. Freeze and hard-block apply only to API keys listed in the lab registry (config/agents.json). The default bind is 127.0.0.1. Tool backends in this prototype are simulated echoes. There is no outbound call unless a webhook stub is turned on, and that stub defaults to off. This is not a production web application firewall, and it is not Web Bot Auth [34].</w:t>
+      </w:r>
+    </w:p>
+    <w:p>
+      <w:r>
+        <w:t>The recorded test run is 14 of 14 passed, including a 7 of 7 ATLAS falsification suite: tainted external parameter egress, scratchpad inheritance, a bound approval token that rejects an argument swap and a replay, delegation fan-out, tools/list ingest, and an allowlisted constrained sink [46]. These tests check that the gates reject the cases they were written to reject. They are not a production evaluation, and they say nothing about visitors who were never given a lab key.</w:t>
       </w:r>
     </w:p>
     <w:p>
@@ -1790,7 +2755,7 @@
     <w:p>
       <w:pPr/>
       <w:r>
-        <w:t>This section compares the companion code with work that already exists: a honeypot and log detector (decoy API documents, a decoy MCP endpoint, canary pages, a coordination board with a handoff token and nonce, a secret scrubber, passive detectors for asset starvation and unlinked jumps, an ARIA canary and a three-boolean interaction beacon, score floors, a harness fingerprint, a static replay page) plus the multi-layer pipeline. The comparison rests on a limited public web search on 23 October 2026, not a systematic review. Each source in the table was opened and read; the full table, dates and the items that could not be verified are in the project file docs/prior-art.md [45]. Wherever the table says “not found in my search”, that means exactly that: I did not find it documented in the pages I read, which is not evidence that the capability is absent. Drosera [27] overlaps the web side most closely.</w:t>
+        <w:t>This section compares the companion code with work that already exists: a honeypot and log detector (decoy API documents, a decoy MCP endpoint, canary pages, a coordination board with a handoff token and nonce, a secret scrubber, passive detectors for asset starvation and unlinked jumps, an ARIA canary and a three-boolean interaction beacon, score floors, a harness fingerprint, a static replay page) plus the multi-layer pipeline. The comparison rests on a limited public web search on 23 October 2026, not a systematic review. Each source in the table was opened and read; the full table, dates and the items that could not be verified are in the project file docs/prior-art.md [45]. Wherever the table says “not found in my search”, that means exactly that: I did not find it documented in the pages I read, which is not evidence that the capability is absent. Drosera [27] overlaps the web side most closely. v6 trap details, the loopback sample, the offline analyzer and the lab gateway are in sections 4 and 6. They are not folded into the synthetic counts in the table.</w:t>
       </w:r>
     </w:p>
     <w:tbl>
@@ -1852,7 +2817,7 @@
                 <w:b/>
                 <w:sz w:val="19"/>
               </w:rPr>
-              <w:t>This stack (all numbers synthetic, same author)</w:t>
+              <w:t>This stack (synthetic numbers are same-author; loopback is section 4, not this table)</w:t>
             </w:r>
           </w:p>
         </w:tc>
@@ -2292,7 +3257,7 @@
               <w:rPr>
                 <w:sz w:val="19"/>
               </w:rPr>
-              <w:t>None. Localhost and synthetic only.</w:t>
+              <w:t>No wild deployment. Loopback only: local qwen2.5:3b and Playwright on 127.0.0.1; 2 of 13 non-control archives caught (section 4). Same author, tiny n. Not a benchmark.</w:t>
             </w:r>
           </w:p>
         </w:tc>
@@ -2319,11 +3284,9 @@
         <w:rPr>
           <w:b/>
         </w:rPr>
-        <w:t xml:space="preserve">Where this stack extends prior art (possibly new, unproven). </w:t>
+        <w:t>Where this stack extends prior art (possibly new, unproven). (1) Selective blocking versus starvation: the asset-starvation signal is typed by what was skipped, which removed the false positive for people who block images (in the agent-watch simulation, 15 of 15 such clients were alerted in v3 and 0 of 15 in v4). (2) Link-graph and trap evidence for browser-backed mimics: each page move is scored against the links the honeypot actually served, with an empirical fallback for ordinary logs, and an ARIA canary plus a three-boolean beacon target clients that look like browsers. In the 135-client pipeline simulation (9 mimic cohorts over 5 seeds) the share producing a lead rose from 0 percent in v2 to 33 percent in v3 and 78 percent in v4 (105 of 135). The cohort that loads CSS and script and sends correct headers (mimic_assets) went from 0 of 15 to 15 of 15, but only because the simulated mimic fetches our script and never runs it; two evaders (a stealth browser and a header forger) were still missed in that v4 simulation, 0 of 15 each. The v6 paired check moved those two cohorts; see the paragraph after the cost note, and do not read the v4 share as a current accuracy. (3) Coordination and harness evidence: a handoff token replayed from a different session or address, a capped claim loop, and a deterministic harness-archetype label with reasons. (4) Integration and honest reporting: the pseudonymized output feeds a separate pipeline with a two-signal corroboration gate and per-layer attribution of every lead. The search found each half in separate projects but no project doing both; finding no equivalent is not proof that none exists.</w:t>
       </w:r>
-      <w:r>
-        <w:t>(1) Selective blocking versus starvation: the asset-starvation signal is typed by what was skipped, which removed the false positive for people who block images (in the agent-watch simulation, 15 of 15 such clients were alerted in v3 and 0 of 15 in v4). (2) Link-graph and trap evidence for browser-backed mimics: each page move is scored against the links the honeypot actually served, with an empirical fallback for ordinary logs, and an ARIA canary plus a three-boolean beacon target clients that look like browsers. In the 135-client pipeline simulation (9 mimic cohorts over 5 seeds) the share producing a lead rose from 0 percent in v2 to 33 percent in v3 and 78 percent in v4 (105 of 135). The cohort that loads CSS and script and sends correct headers (mimic_assets) went from 0 of 15 to 15 of 15, but only because the simulated mimic fetches our script and never runs it; two evaders (a stealth browser and a header forger) are still missed, 0 of 15 each. (3) Coordination and harness evidence: a handoff token replayed from a different session or address, a capped claim loop, and a deterministic harness-archetype label with reasons. (4) Integration and honest reporting: the pseudonymized output feeds a separate pipeline with a two-signal corroboration gate and per-layer attribution of every lead. The search found each half in separate projects but no project doing both; finding no equivalent is not proof that none exists.</w:t>
-      </w:r>
+      <w:r/>
     </w:p>
     <w:p>
       <w:pPr/>
@@ -2338,16 +3301,19 @@
       </w:r>
     </w:p>
     <w:p>
+      <w:r>
+        <w:t>v6 synthetic check, still same-author [46]. On paired traffic, agent-watch human alerts fell from 15 of 75 to 0 of 75, the pipeline web false-positive rate from 39 of 575 (0.068) to 14 of 575 (0.024), and the core standard false-positive rate stayed 21 of 605 (0.035). All-evasive core recall rose from 0 of 80 to 12 of 80, all of it the access-prober cohort. In that same check the stealth browser and the header forger are no longer 0 of 15 pipeline leads (10 of 15 and 10 of 15). The cost is the documented regression: mimic_assets and mimic_linked_nosec fell from 15 of 15 to 0 of 15 pipeline leads, because they now look like the humans whose false positives were removed. Those figures do not describe the loopback sample in section 4, where the catch rate on non-control archives is 2 of 13.</w:t>
+      </w:r>
+    </w:p>
+    <w:p>
       <w:pPr/>
       <w:r>
         <w:rPr>
           <w:b/>
         </w:rPr>
-        <w:t xml:space="preserve">Honest evaluation boundaries. </w:t>
+        <w:t>Honest evaluation boundaries. The figures in this section, and in the v3 to v5 prototype table, are synthetic same-author regression checks, not benchmarks: the simulated clients, including each mimic, were written by the same author as the detectors, with the rules in mind. A honeypot or beacon contact shows contact, not intent. Every web-honeypot output is a lead for human review. The honeypot does not auto-block a public visitor. The lab gateway in section 6 can freeze only a registered internal key, and only inside that prototype. Palisade reports about 8.1 million real attempts [26] and the Li et al. honeysites 26.4 million requests [41]. This project has no wild deployment. The only runs against a live model are loopback: qwen2.5:3b and Playwright Chromium on a honeypot bound to 127.0.0.1, with a catch rate of 2 of 13 on the archived non-control sample (section 4). A second, larger local model was not run (about 5 GiB free RAM and no swap on that machine). There is still no TLS fingerprint layer, although measurement studies find multi-layer fingerprints strongly discriminative [38][39] and some agents bypassed every defense tested [39].</w:t>
       </w:r>
-      <w:r>
-        <w:t>All figures are synthetic same-author regression checks, not benchmarks: the simulated clients, including each mimic, were written by the same author as the detectors, with the rules in mind. A honeypot or beacon contact shows contact, not intent. Every output is a lead for human review; nothing blocks or accuses anyone. Palisade reports about 8.1 million real attempts [26] and the Li et al. honeysites 26.4 million requests [41]; we have no real traffic, no real browser or agent was driven against the code, and no TLS fingerprint layer, although measurement studies find multi-layer fingerprints strongly discriminative [38][39] and some agents bypassed every defense tested [39].</w:t>
-      </w:r>
+      <w:r/>
     </w:p>
     <w:p>
       <w:pPr>
@@ -2399,7 +3365,31 @@
         <w:spacing w:after="60"/>
       </w:pPr>
       <w:r>
-        <w:t>The related-work search in section 9 was a limited public web search on 23 October 2026, not a systematic review; for GitHub projects the README was read, not the code, and none was run. Where a capability is marked “not found in my search” it may still exist. Several projects are weeks or months old and may change. The v3 to v5 figures come from simulated clients written by the same author as the detectors.</w:t>
+        <w:t>The related-work search in section 9 was a limited public web search on 23 October 2026, not a systematic review; for GitHub projects the README was read, not the code, and none was run. Where a capability is marked “not found in my search” it may still exist. Several projects are weeks or months old and may change. The v3 to v5 figures in that section come from simulated clients written by the same author as the detectors.</w:t>
+      </w:r>
+    </w:p>
+    <w:p>
+      <w:pPr>
+        <w:pStyle w:val="ListBullet"/>
+      </w:pPr>
+      <w:r>
+        <w:t>v3 to v6 synthetic figures come from simulated clients written by the same author as the detectors. The v6 paired check is in section 4 and in the project file docs/v6-changes.md [46]. It includes two documented pipeline regressions (mimic_assets and mimic_linked_nosec, each 15 of 15 to 0 of 15).</w:t>
+      </w:r>
+    </w:p>
+    <w:p>
+      <w:pPr>
+        <w:pStyle w:val="ListBullet"/>
+      </w:pPr>
+      <w:r>
+        <w:t>The Tier-2 loopback sample is 14 archived runs on one machine and one 3B model. The 2 of 13 catch rate excludes the scripted human control. It must not be pooled with synthetic recall. No wild honeypot was deployed. A mid-size second model was not run (about 5 GiB free RAM, no swap).</w:t>
+      </w:r>
+    </w:p>
+    <w:p>
+      <w:pPr>
+        <w:pStyle w:val="ListBullet"/>
+      </w:pPr>
+      <w:r>
+        <w:t>Honeypot or beacon contact is not intent. The web honeypot does not auto-block a visitor. Gateway freeze applies only to registered internal lab keys, on 127.0.0.1 by default. The Phase 2 and Phase 3 test counts (14 of 14, including 7 of 7 falsification; 10 of 10 analyzer unit tests) are regression checks of those packages, not a field trial. The analyzer smoke counts are the four rows in section 4 and were not extended.</w:t>
       </w:r>
     </w:p>
     <w:p>
@@ -2950,6 +3940,11 @@
         <w:t>[45] Project file docs/prior-art.md (prior-art table with dates, verification notes and unverified items), 23 Oct 2026.</w:t>
       </w:r>
     </w:p>
+    <w:p>
+      <w:r>
+        <w:t>[46] Project files for this update, 23 to 24 October 2026: docs/v6-changes.md (paired synthetic v5/v6 counts); docs/phase1-tier2-report.md and docs/phase1-fixes.md (loopback archive, R14 and dwell calibration); docs/phase2-gateway.md (AML.M0030 lab gateway, 14 of 14 tests); docs/phase3-analyzer.md (offline analyzer, 12 Sigma rules, 10 of 10 unit tests). The 2 of 13 catch rate and the four-row analyzer smoke are stated in section 4. The smoke was run on Jordan's machine against archived Tier-2 logs and agentwatch-analyzer/tests/fixtures/agentlike_nginx.log.</w:t>
+      </w:r>
+    </w:p>
     <w:sectPr>
       <w:footerReference w:type="default" r:id="rId9"/>
       <w:pgSz w:w="12240" w:h="15840"/>
@@ -2972,7 +3967,7 @@
       <w:rPr>
         <w:sz w:val="16"/>
       </w:rPr>
-      <w:t>Rogue AI Detection in the Wild: whitepaper. Prototype results use synthetic data only.</w:t>
+      <w:t>Rogue AI Detection in the Wild: whitepaper. Synthetic regression checks, plus one loopback sample. No wild deployment.</w:t>
     </w:r>
   </w:p>
 </w:ftr>

</xml_diff>